<commit_message>
Correct project ownership to roll numbers 41-45
</commit_message>
<xml_diff>
--- a/docs/Team_Learning_Guide.docx
+++ b/docs/Team_Learning_Guide.docx
@@ -33,7 +33,7 @@
         <w:rPr>
           <w:b/>
         </w:rPr>
-        <w:t>Study Project  |  Roll Number 43</w:t>
+        <w:t>Study Project  |  Roll Numbers 41-45</w:t>
         <w:br/>
       </w:r>
       <w:r>
@@ -359,7 +359,7 @@
               <w:rPr>
                 <w:sz w:val="19"/>
               </w:rPr>
-              <w:t>43</w:t>
+              <w:t>42</w:t>
             </w:r>
           </w:p>
         </w:tc>
@@ -1038,7 +1038,7 @@
     </w:p>
     <w:p>
       <w:r>
-        <w:t>The split is stratified and uses seed 43. Augmentation is applied after splitting and only to training images. This prevents augmented versions of a test image from leaking into training.</w:t>
+        <w:t>The split is stratified and uses seed 42. Augmentation is applied after splitting and only to training images. This prevents augmented versions of a test image from leaking into training.</w:t>
       </w:r>
     </w:p>
     <w:p>
@@ -1725,7 +1725,7 @@
         <w:pStyle w:val="ListNumber"/>
       </w:pPr>
       <w:r>
-        <w:t>Setup imports, folders, and random seed 43.</w:t>
+        <w:t>Setup imports, folders, and random seed 42.</w:t>
       </w:r>
     </w:p>
     <w:p>
@@ -2461,7 +2461,7 @@
               <w:rPr>
                 <w:sz w:val="19"/>
               </w:rPr>
-              <w:t>43</w:t>
+              <w:t>42</w:t>
             </w:r>
           </w:p>
         </w:tc>
@@ -2485,7 +2485,7 @@
               <w:rPr>
                 <w:sz w:val="19"/>
               </w:rPr>
-              <w:t>Reproducible and tied to the assigned roll number</w:t>
+              <w:t>Standard reproducible experiment seed</w:t>
             </w:r>
           </w:p>
         </w:tc>
@@ -4085,7 +4085,7 @@
               <w:rPr>
                 <w:sz w:val="19"/>
               </w:rPr>
-              <w:t>Member 1</w:t>
+              <w:t>Roll 41</w:t>
             </w:r>
           </w:p>
         </w:tc>
@@ -4134,7 +4134,7 @@
               <w:rPr>
                 <w:sz w:val="19"/>
               </w:rPr>
-              <w:t>Member 2</w:t>
+              <w:t>Roll 42</w:t>
             </w:r>
           </w:p>
         </w:tc>
@@ -4183,7 +4183,7 @@
               <w:rPr>
                 <w:sz w:val="19"/>
               </w:rPr>
-              <w:t>Member 3</w:t>
+              <w:t>Roll 43</w:t>
             </w:r>
           </w:p>
         </w:tc>
@@ -4232,7 +4232,7 @@
               <w:rPr>
                 <w:sz w:val="19"/>
               </w:rPr>
-              <w:t>Member 4</w:t>
+              <w:t>Roll 44</w:t>
             </w:r>
           </w:p>
         </w:tc>
@@ -4281,7 +4281,7 @@
               <w:rPr>
                 <w:sz w:val="19"/>
               </w:rPr>
-              <w:t>Member 5</w:t>
+              <w:t>Roll 45</w:t>
             </w:r>
           </w:p>
         </w:tc>
@@ -4317,7 +4317,7 @@
     </w:p>
     <w:p>
       <w:r>
-        <w:t>Every member should still understand the complete workflow. Roll number 43 should be able to connect all sections, explain why class weighting was used, and distinguish validation results from final test results.</w:t>
+        <w:t>Every member should still understand the complete workflow. All students from roll numbers 41-45 should be able to connect all sections, explain why class weighting was used, and distinguish validation results from final test results.</w:t>
       </w:r>
     </w:p>
     <w:p>
@@ -5441,7 +5441,7 @@
         <w:color w:val="595959"/>
         <w:sz w:val="16"/>
       </w:rPr>
-      <w:t>CNN Crop and Weed Classification  |  Roll Number 43</w:t>
+      <w:t>CNN Crop and Weed Classification  |  Roll Numbers 41-45</w:t>
     </w:r>
   </w:p>
 </w:ftr>

</xml_diff>